<commit_message>
Add fct6_grantee_annual_info (4.02) and fct5.aspect_display (4.04)
Co-Authored-By: Claude Sonnet 5.5 <noreply@anthropic.com>
Claude-Session: https://claude.ai/code/session_01FFbDqRwNxoFc93qUhfJngK
</commit_message>
<xml_diff>
--- a/docs/APFP_Dashboard_Review_and_Cowork_Fixes.docx
+++ b/docs/APFP_Dashboard_Review_and_Cowork_Fixes.docx
@@ -212,7 +212,7 @@
           <w:sz w:val="20"/>
           <w:szCs w:val="20"/>
         </w:rPr>
-        <w:t xml:space="preserve">Two things cannot be done in Looker alone: 4.02 (needs a pipeline table) and merged aspect cells in 4.04 (optional aspect_display column).</w:t>
+        <w:t xml:space="preserve">4.02 and 4.04 needed pipeline support; both are now built (fct6_grantee_annual_info and fct5.aspect_display, v0.1.7). Deploy before Cowork starts on them.</w:t>
       </w:r>
     </w:p>
     <w:p>
@@ -5783,7 +5783,7 @@
                 <w:sz w:val="16"/>
                 <w:szCs w:val="16"/>
               </w:rPr>
-              <w:t xml:space="preserve">Looker cannot transpose. Needs a pipeline table with one row per organisation × metric holding selected-year and previous-year values (proposed fct6_grantee_annual_info). Until it exists, do not restructure; mark as pending.</w:t>
+              <w:t xml:space="preserve">Resolved in the pipeline (v0.1.7): new tab fct6_grantee_annual_info. Add it as a data source (Resource → Manage added data sources → Add data → Google Sheets → Data Pipeline → fct6_grantee_annual_info). Replace 4.02 with a Table on it: dimensions metric, current_value, previous_value; sort metric_order ascending; no metrics. Header labels: metric = "Metric"; the first row (metric_order 1, "Financial year") carries the year labels, so style that row bold with a #F4F6F9 background (conditional format on metric = Financial year). Report-level FY control must apply (field financial_year), plus Organisation and Grant Status. Show 8 rows, no pagination.</w:t>
             </w:r>
           </w:p>
         </w:tc>
@@ -6205,7 +6205,7 @@
                 <w:sz w:val="16"/>
                 <w:szCs w:val="16"/>
               </w:rPr>
-              <w:t xml:space="preserve">Use the field holding the performance status (not grant status). Spanning aspect cells are not possible: show the aspect on the first row only via an aspect_display column (optional pipeline change).</w:t>
+              <w:t xml:space="preserve">Use the new fct5 column aspect_display (v0.1.7) instead of aspect: dimensions aspect_display, indicator, status; sort by aspect, then indicator (keep aspect as a hidden sort field or sort by aspect ascending, indicator ascending). Blank aspect cells then give the merged look. Status must be the RAG status (Red/Amber/Green) with the RAG colours; the "Active" value is a grant status, not a maturity status.</w:t>
             </w:r>
           </w:p>
         </w:tc>
@@ -7314,7 +7314,7 @@
                 <w:sz w:val="17"/>
                 <w:szCs w:val="17"/>
               </w:rPr>
-              <w:t xml:space="preserve">New pipeline table fct6_grantee_annual_info: one row per organisation × financial year × metric with this-year and previous-year values side by side. Table then shows metric rows and two year columns. Needs approval; I add it with tests.</w:t>
+              <w:t xml:space="preserve">DONE in the pipeline (v0.1.7): fct6_grantee_annual_info, metric rows with this-year and previous-year values side by side. Cowork builds the table on it.</w:t>
             </w:r>
           </w:p>
         </w:tc>
@@ -7421,7 +7421,7 @@
                 <w:sz w:val="17"/>
                 <w:szCs w:val="17"/>
               </w:rPr>
-              <w:t xml:space="preserve">aspect_display column (aspect on the first indicator row, blank after), sorted by aspect then indicator. Optional.</w:t>
+              <w:t xml:space="preserve">DONE in the pipeline (v0.1.7): fct5 column aspect_display (aspect on the first row of each block, blank after). Cowork switches the Aspect column to it.</w:t>
             </w:r>
           </w:p>
         </w:tc>
@@ -8004,26 +8004,7 @@
           <w:sz w:val="20"/>
           <w:szCs w:val="20"/>
         </w:rPr>
-        <w:t xml:space="preserve">Approve a new pipeline table fct6_grantee_annual_info for 4.02 (recommended) instead of a fragile Looker-only blend.</w:t>
-      </w:r>
-    </w:p>
-    <w:p>
-      <w:pPr>
-        <w:pStyle w:val="ListParagraph"/>
-        <w:numPr>
-          <w:ilvl w:val="0"/>
-          <w:numId w:val="2"/>
-        </w:numPr>
-        <w:spacing w:after="60" w:line="264"/>
-      </w:pPr>
-      <w:r>
-        <w:rPr>
-          <w:rFonts w:ascii="Calibri" w:cs="Calibri" w:eastAsia="Calibri" w:hAnsi="Calibri"/>
-          <w:color w:val="1E2838"/>
-          <w:sz w:val="20"/>
-          <w:szCs w:val="20"/>
-        </w:rPr>
-        <w:t xml:space="preserve">Approve an optional aspect_display column for 4.04.</w:t>
+        <w:t xml:space="preserve">Approved and built: fct6_grantee_annual_info (4.02) and fct5.aspect_display (4.04). Deploy the pipeline first, then Cowork can use them.</w:t>
       </w:r>
     </w:p>
     <w:p>
@@ -8534,7 +8515,7 @@
           <w:sz w:val="15"/>
           <w:szCs w:val="15"/>
         </w:rPr>
-        <w:t xml:space="preserve">8. PAGE 5: 4.01 and 4.08 label blocks (left side) fill #0E4A5C with white text; add amount and grant period to 4.01. 4.04 show performance status (On Track / Off Track), not "Active". 4.05 column headers: Target, Q1, Q2, Q3, Q4, Annual, Notes (as the build spec). 4.07 remove Record Count, add "Support provided" (field response_category). 4.08 recommendation row must show the recommendation; rationale in a separate tile.</w:t>
+        <w:t xml:space="preserve">8. PAGE 5: 4.01 and 4.08 label blocks (left side) fill #0E4A5C with white text; add amount and grant period to 4.01. 4.04 status must show the RAG value (Red/Amber/Green) with RAG colours, not "Active". 4.05 column headers: Target, Q1, Q2, Q3, Q4, Annual, Notes (as the build spec). 4.07 remove Record Count, add "Support provided" (field response_category). 4.08 recommendation row must show the recommendation; rationale in a separate tile.</w:t>
       </w:r>
     </w:p>
     <w:p>
@@ -8553,7 +8534,26 @@
           <w:sz w:val="15"/>
           <w:szCs w:val="15"/>
         </w:rPr>
-        <w:t xml:space="preserve">9. 4.02: do NOT restructure for now. Leave as is and write "pending pipeline table" in your report.</w:t>
+        <w:t xml:space="preserve">9. 4.02 (only after the owner confirms the pipeline is updated and the tab fct6_grantee_annual_info exists): add data source fct6_grantee_annual_info (Data Pipeline sheet). Rebuild 4.02 as a Table on it: dimensions metric, current_value, previous_value; no metrics; sort metric_order ascending; show all 8 rows. The row "Financial year" holds the year labels: bold it with a #F4F6F9 background (conditional format on metric = Financial year). Column headers: Metric, Selected year, Previous year. Controls Financial Year (report level, field financial_year), Organisation and Grant Status must filter it. A value of – means that year has no data.</w:t>
+      </w:r>
+    </w:p>
+    <w:p>
+      <w:pPr>
+        <w:pBdr>
+          <w:left w:val="single" w:color="167C88" w:sz="12" w:space="6"/>
+        </w:pBdr>
+        <w:shd w:fill="F1F4F6" w:color="auto" w:val="clear"/>
+        <w:spacing w:after="0" w:line="240"/>
+        <w:ind w:left="120" w:right="120"/>
+      </w:pPr>
+      <w:r>
+        <w:rPr>
+          <w:rFonts w:ascii="Consolas" w:cs="Consolas" w:eastAsia="Consolas" w:hAnsi="Consolas"/>
+          <w:color w:val="1E2838"/>
+          <w:sz w:val="15"/>
+          <w:szCs w:val="15"/>
+        </w:rPr>
+        <w:t xml:space="preserve">10. 4.04 (same condition: fct5 refreshed): use field aspect_display instead of aspect (aspect shows once per block, blank below), then indicator, then status. Sort by aspect ascending then indicator ascending. After the data source is refreshed (Resource → Manage added data sources → refresh fields) the new columns appear.</w:t>
       </w:r>
     </w:p>
     <w:p>

</xml_diff>

<commit_message>
Add exact link_360 formula for pre-filtered Grantee 360 link
Co-Authored-By: Claude Sonnet 5.5 <noreply@anthropic.com>
Claude-Session: https://claude.ai/code/session_01FFbDqRwNxoFc93qUhfJngK
</commit_message>
<xml_diff>
--- a/docs/APFP_Dashboard_Review_and_Cowork_Fixes.docx
+++ b/docs/APFP_Dashboard_Review_and_Cowork_Fixes.docx
@@ -4881,7 +4881,7 @@
                 <w:sz w:val="16"/>
                 <w:szCs w:val="16"/>
               </w:rPr>
-              <w:t xml:space="preserve">1) File → Report settings → turn on Enable viewer filters in report link. 2) In view mode choose an organisation in the Grantee 360 control and copy the page URL; it contains ?params={"df&lt;N&gt;":...}. 3) Rebuild link_360 = HYPERLINK(CONCAT("&lt;page URL&gt;?params=%7B%22df&lt;N&gt;%22:%22include%EE%80%800%EE%80%80IN%EE%80%80", REGEXP_REPLACE(organisation," ","%20"), "%22%7D"), "Click here") using the real df&lt;N&gt;. Test with an organisation containing &amp; or , (needs extra escaping: %26 / %2C).</w:t>
+              <w:t xml:space="preserve">URL parameter confirmed by the owner: df232 on page p_0lm6sfxw7d, value include·0·IN·&lt;name&gt; (separator U+E000), double-encoded. Set link_360 (fct1) to the formula in docs/looker_calculated_fields.txt (also in the Cowork prompt, item 7). Do not delete/recreate the Organisation control (df232 would change). Test with Civic Leadership Forum and Paws &amp; Care Trust (&amp; is encoded %2526). The link carries only the organisation; Financial Year and Grant Status stay at their defaults.</w:t>
             </w:r>
           </w:p>
         </w:tc>
@@ -8023,7 +8023,7 @@
           <w:sz w:val="20"/>
           <w:szCs w:val="20"/>
         </w:rPr>
-        <w:t xml:space="preserve">Send the real Grantee 360 URL (with an organisation selected, after enabling viewer filters in the link) so link_360 can be written with the exact df&lt;N&gt; parameter.</w:t>
+        <w:t xml:space="preserve">Replace the placeholder Support Provided dropdown values (Support 1/2) in the source when the final list is ready; no pipeline change needed.</w:t>
       </w:r>
     </w:p>
     <w:p>
@@ -8042,7 +8042,7 @@
           <w:sz w:val="20"/>
           <w:szCs w:val="20"/>
         </w:rPr>
-        <w:t xml:space="preserve">Replace the placeholder Support Provided dropdown values (Support 1/2) in the source when the final list is ready; no pipeline change needed.</w:t>
+        <w:t xml:space="preserve">Link scope: the link preselects the organisation only. If it must also carry a financial year, send a second URL with one selected.</w:t>
       </w:r>
     </w:p>
     <w:p>
@@ -8496,7 +8496,26 @@
           <w:sz w:val="15"/>
           <w:szCs w:val="15"/>
         </w:rPr>
-        <w:t xml:space="preserve">7. CLICK HERE (3.07): File → Report settings → enable "Enable viewer filters in report link". In view mode select an organisation in the Grantee 360 control, copy the page URL, read the df&lt;N&gt; parameter. Then change link_360 to HYPERLINK(CONCAT("&lt;page URL&gt;?params=%7B%22df&lt;N&gt;%22:%22include%EE%80%800%EE%80%80IN%EE%80%80", REGEXP_REPLACE(organisation," ","%20"), "%22%7D"), "Click here"). Test it opens Grantee 360 filtered. Report the exact URL pattern you ended with.</w:t>
+        <w:t xml:space="preserve">7. CLICK HERE (3.07): "Enable viewer filters in report link" is already ON; do not change any other report setting. In fct1_grant_portfolio edit the calculated field link_360 and set its formula to exactly the text below (one line). It targets the Grantee 360 page (p_0lm6sfxw7d) and the Organisation control's filter parameter df232, so do NOT delete or recreate that Organisation control (its ID would change). Test in View mode: click "Click here" for Civic Leadership Forum and for Paws &amp; Care Trust; Grantee 360 must open with that organisation selected. Report the result.</w:t>
+      </w:r>
+    </w:p>
+    <w:p>
+      <w:pPr>
+        <w:pBdr>
+          <w:left w:val="single" w:color="167C88" w:sz="12" w:space="6"/>
+        </w:pBdr>
+        <w:shd w:fill="F1F4F6" w:color="auto" w:val="clear"/>
+        <w:spacing w:after="0" w:line="240"/>
+        <w:ind w:left="120" w:right="120"/>
+      </w:pPr>
+      <w:r>
+        <w:rPr>
+          <w:rFonts w:ascii="Consolas" w:cs="Consolas" w:eastAsia="Consolas" w:hAnsi="Consolas"/>
+          <w:color w:val="1E2838"/>
+          <w:sz w:val="15"/>
+          <w:szCs w:val="15"/>
+        </w:rPr>
+        <w:t xml:space="preserve">HYPERLINK(CONCAT("https://datastudio.google.com/reporting/dba82e50-a6d6-4ef3-a273-ff3b0b827046/page/p_0lm6sfxw7d?params=%7B%22df232%22:%22include%25EE%2580%25800%25EE%2580%2580IN%25EE%2580%2580", REGEXP_REPLACE(REGEXP_REPLACE(REGEXP_REPLACE(REGEXP_REPLACE(REGEXP_REPLACE(REGEXP_REPLACE(REGEXP_REPLACE(REGEXP_REPLACE(organisation, "%", "%2525"), " ", "%2520"), "&amp;", "%2526"), ",", "%252C"), "/", "%252F"), "\+", "%252B"), "#", "%2523"), "'", "%2527"), "%22%7D"), "Click here")</w:t>
       </w:r>
     </w:p>
     <w:p>

</xml_diff>